<commit_message>
UD06/UD07: añade boletines Packet Tracer y corrige tabla del resuelto PT de dirección IP
</commit_message>
<xml_diff>
--- a/docx/04-direccionamiento-ip/boletin-U04-packettracer-resuelto.docx
+++ b/docx/04-direccionamiento-ip/boletin-U04-packettracer-resuelto.docx
@@ -2604,7 +2604,7 @@
               <w:jc w:val="left"/>
             </w:pPr>
             <w:r>
-              <w:t xml:space="preserve">2, 5–6</w:t>
+              <w:t xml:space="preserve">2, 4–5</w:t>
             </w:r>
           </w:p>
         </w:tc>
@@ -2642,7 +2642,7 @@
               <w:jc w:val="left"/>
             </w:pPr>
             <w:r>
-              <w:t xml:space="preserve">8</w:t>
+              <w:t xml:space="preserve">7</w:t>
             </w:r>
           </w:p>
         </w:tc>
@@ -2680,7 +2680,7 @@
               <w:jc w:val="left"/>
             </w:pPr>
             <w:r>
-              <w:t xml:space="preserve">8</w:t>
+              <w:t xml:space="preserve">7</w:t>
             </w:r>
           </w:p>
         </w:tc>
@@ -2756,7 +2756,7 @@
               <w:jc w:val="left"/>
             </w:pPr>
             <w:r>
-              <w:t xml:space="preserve">12, 16</w:t>
+              <w:t xml:space="preserve">10, 12</w:t>
             </w:r>
           </w:p>
         </w:tc>

</xml_diff>